<commit_message>
test: update smoke_translate_docx.py with robust fixture handling and fallbacks
</commit_message>
<xml_diff>
--- a/tests/fixtures/cli_sample.docx
+++ b/tests/fixtures/cli_sample.docx
@@ -4,20 +4,17 @@
   <w:body>
     <w:p>
       <w:r>
-        <w:rPr>
-          <w:b/>
-        </w:rPr>
-        <w:t>重要な日本語テキスト</w:t>
+        <w:t>こんにちは世界！</w:t>
       </w:r>
     </w:p>
     <w:p>
       <w:r>
-        <w:t>次の文を翻訳してください。</w:t>
+        <w:t>This is a mixed language document.</w:t>
       </w:r>
     </w:p>
     <w:p>
       <w:r>
-        <w:t>English reference line.</w:t>
+        <w:t>翻訳テスト用の文書です。</w:t>
       </w:r>
     </w:p>
   </w:body>

</xml_diff>